<commit_message>
A line for the attorney to sign on, everywhere they sign
The petition had "By:" and nothing after it — nowhere for a pen to go, and
nowhere for the signature image to land either. Nine more spots across ten
templates were the same or worse: two stood a run of six underlined tabs in for
a line, which only draws one if the tab stops are somewhere sensible. In the
pilot petition they were not — the stop at 720 was cleared and the only one left
was at -720.

All twelve places the attorney signs now carry the same underscore rule the
filing packet already had, with the signature anchored over it. "Filed By:" on
the packet's checklist is left alone; it names who filed a page rather than
asking anyone to sign it.

Co-Authored-By: Claude Opus 5 <noreply@anthropic.com>
</commit_message>
<xml_diff>
--- a/templates/dhs/dhs_concurrent_jurisdiction.docx
+++ b/templates/dhs/dhs_concurrent_jurisdiction.docx
@@ -697,28 +697,7 @@
           <w:sz w:val="24"/>
           <w:szCs w:val="24"/>
         </w:rPr>
-        <w:t xml:space="preserve">By:{% if attorney_signature %}  {{ attorney_signature }}{% endif %}</w:t>
-      </w:r>
-      <w:r>
-        <w:rPr>
-          <w:rFonts w:ascii="Times New Roman" w:hAnsi="Times New Roman" w:cs="Times New Roman"/>
-          <w:sz w:val="24"/>
-          <w:szCs w:val="24"/>
-          <w:u w:val="single"/>
-        </w:rPr>
-        <w:t xml:space="preserve"/>
-        <w:tab/>
-        <w:t xml:space="preserve"/>
-        <w:tab/>
-        <w:t xml:space="preserve"/>
-        <w:tab/>
-        <w:t xml:space="preserve"/>
-        <w:tab/>
-        <w:t xml:space="preserve"/>
-        <w:tab/>
-        <w:t xml:space="preserve"/>
-        <w:tab/>
-        <w:t xml:space="preserve"/>
+        <w:t xml:space="preserve">By:{% if attorney_signature %}  {{ attorney_signature }}{% endif %}____________________</w:t>
       </w:r>
     </w:p>
     <w:p>

</xml_diff>

<commit_message>
Straighten the judge's block on the concurrent jurisdiction order
The two lines were indented to 3" and then tabbed five times on top of that,
which starts the text at 5.5". A 37-character rule does not fit in the inch
that leaves, so it wrapped onto a second line, and justification stretched
the first one across the page to meet it — which is what read as double
spacing.

The indent alone puts the block where it belongs, and a rule somebody signs
above is not justified text. It now has the same shape as the attorney's
block on the page before: 3" left, single spaced, no space after.

These were the only two paragraphs in any template that stacked tabs on top
of an indent; every other tab in the filing separates a list number from its
text or sits in a notary block at the margin.

Co-Authored-By: Claude Opus 5 <noreply@anthropic.com>
</commit_message>
<xml_diff>
--- a/templates/dhs/dhs_concurrent_jurisdiction.docx
+++ b/templates/dhs/dhs_concurrent_jurisdiction.docx
@@ -1398,7 +1398,6 @@
       <w:pPr>
         <w:spacing w:after="0" w:line="240" w:lineRule="auto"/>
         <w:ind w:left="4320"/>
-        <w:jc w:val="both"/>
       </w:pPr>
       <w:r>
         <w:rPr>
@@ -1407,16 +1406,6 @@
           <w:szCs w:val="24"/>
           <w:b/>
         </w:rPr>
-        <w:t xml:space="preserve"/>
-        <w:tab/>
-        <w:t xml:space="preserve"/>
-        <w:tab/>
-        <w:t xml:space="preserve"/>
-        <w:tab/>
-        <w:t xml:space="preserve"/>
-        <w:tab/>
-        <w:t xml:space="preserve"/>
-        <w:tab/>
         <w:t xml:space="preserve">_____________________________________</w:t>
       </w:r>
     </w:p>
@@ -1424,7 +1413,6 @@
       <w:pPr>
         <w:spacing w:after="0" w:line="240" w:lineRule="auto"/>
         <w:ind w:left="4320"/>
-        <w:jc w:val="both"/>
       </w:pPr>
       <w:r>
         <w:rPr>
@@ -1433,16 +1421,6 @@
           <w:szCs w:val="24"/>
           <w:b/>
         </w:rPr>
-        <w:t xml:space="preserve"/>
-        <w:tab/>
-        <w:t xml:space="preserve"/>
-        <w:tab/>
-        <w:t xml:space="preserve"/>
-        <w:tab/>
-        <w:t xml:space="preserve"/>
-        <w:tab/>
-        <w:t xml:space="preserve"/>
-        <w:tab/>
         <w:t xml:space="preserve">JUDGE OF THE DISTRICT COURT</w:t>
       </w:r>
     </w:p>

</xml_diff>